<commit_message>
Public release 1.2.0: paper cites the public artifact; acknowledgments
Co-Authored-By: Claude Fable 5.1 <noreply@anthropic.com>
</commit_message>
<xml_diff>
--- a/docs/REST_Kafka_Exploratory_Findings_Draft.docx
+++ b/docs/REST_Kafka_Exploratory_Findings_Draft.docx
@@ -8039,7 +8039,7 @@
           <w:color w:val="000000"/>
           <w:sz w:val="20"/>
         </w:rPr>
-        <w:t>The accompanying local results package documents the evidence roots, software dependencies, analysis commands, resource scope, and unexecuted follow-up proposal. The original pre-results manuscript and frozen run evidence remain unchanged. A public archival identifier, redistribution licence, and independent reproduction have not yet been established; we therefore claim local reproducibility support, not a publicly verified artifact.</w:t>
+        <w:t>The code, a redacted copy of the evidence for all sixteen runs, the analysis, the figures, and this draft are publicly available [17] under Apache-2.0 for code and CC BY 4.0 for evidence and text, with an archival identifier pending. The public copy is generated from the private archive by scripts that replace the capture host name, home paths, Docker identity, and the names of unrelated containers with neutral tokens and record the SHA-256 of every original file, so it can be verified against the archive; no experiment number depends on a redacted field. The public repository also lets another site start its own guarded chain with the same protocols. Independent reproduction by a third party has not yet been established.</w:t>
       </w:r>
     </w:p>
     <w:p>
@@ -8078,6 +8078,44 @@
           <w:sz w:val="20"/>
         </w:rPr>
         <w:t>This exploratory benchmark links synthetic transfer traffic to durable completion and ledger correctness under one common asynchronous client contract. In sixteen executions (six reporting-set, six archived same-application, four fresh Kafka-first), every measured transfer completed correctly. REST had lower observed completion tails and sampled resource use in every pair, under both realized orders; both implementations accumulated and later cleared fault-induced backlogs. While database responses were delayed, in-fault completions were higher for REST (72) than for Kafka (15) in the original pair and higher for REST (73) than for Kafka (13) in the fresh Kafka-first pair, consistent in both pairs with Kafka's larger statement count. The results support a bounded comparison of these implementations and identify questions for further testing. They do not establish capacity, general architecture superiority, or equivalent recovery time. Further repetitions under both orders and focused configuration sensitivity would strengthen those inferences.</w:t>
+      </w:r>
+    </w:p>
+    <w:p>
+      <w:pPr>
+        <w:pStyle w:val="Heading1"/>
+        <w:keepNext/>
+        <w:widowControl/>
+        <w:spacing w:before="140" w:after="40" w:line="240" w:lineRule="auto"/>
+        <w:ind w:firstLine="0"/>
+        <w:jc w:val="center"/>
+      </w:pPr>
+      <w:r>
+        <w:rPr>
+          <w:rFonts w:ascii="Times New Roman" w:hAnsi="Times New Roman"/>
+          <w:b w:val="0"/>
+          <w:i w:val="0"/>
+          <w:color w:val="000000"/>
+          <w:sz w:val="20"/>
+        </w:rPr>
+        <w:t>ACKNOWLEDGMENTS</w:t>
+      </w:r>
+    </w:p>
+    <w:p>
+      <w:pPr>
+        <w:widowControl/>
+        <w:spacing w:before="0" w:after="0" w:line="240" w:lineRule="auto"/>
+        <w:ind w:firstLine="0"/>
+        <w:jc w:val="both"/>
+      </w:pPr>
+      <w:r>
+        <w:rPr>
+          <w:rFonts w:ascii="Times New Roman" w:hAnsi="Times New Roman"/>
+          <w:b w:val="0"/>
+          <w:i w:val="0"/>
+          <w:color w:val="000000"/>
+          <w:sz w:val="20"/>
+        </w:rPr>
+        <w:t>The author used Claude to improve the readability and language quality of this manuscript, and Claude Code for code development support. All content was reviewed and edited by the author, who takes full responsibility for the final work.</w:t>
       </w:r>
     </w:p>
     <w:p>
@@ -8386,6 +8424,24 @@
           <w:sz w:val="16"/>
         </w:rPr>
         <w:t>[16] Mojaloop Foundation, “Mojaloop Hub,” Mojaloop documentation, 2022. https://docs.mojaloop.io/technical/overview/</w:t>
+      </w:r>
+    </w:p>
+    <w:p>
+      <w:pPr>
+        <w:widowControl/>
+        <w:spacing w:before="0" w:after="40" w:line="240" w:lineRule="auto"/>
+        <w:ind w:left="230" w:hanging="230"/>
+        <w:jc w:val="left"/>
+      </w:pPr>
+      <w:r>
+        <w:rPr>
+          <w:rFonts w:ascii="Times New Roman" w:hAnsi="Times New Roman"/>
+          <w:b w:val="0"/>
+          <w:i w:val="0"/>
+          <w:color w:val="000000"/>
+          <w:sz w:val="16"/>
+        </w:rPr>
+        <w:t>[17] S. Lubanga, “Mobile-money coordination benchmark: Code, redacted evidence, analysis and paper,” v1.2.0, GitHub, 2026. https://github.com/shaban2/mobile-money-coordination-benchmark</w:t>
       </w:r>
     </w:p>
     <w:sectPr>

</xml_diff>

<commit_message>
Public release 1.2.2: DOI in paper, citation file and README
Co-Authored-By: Claude Fable 5.1 <noreply@anthropic.com>
</commit_message>
<xml_diff>
--- a/docs/REST_Kafka_Exploratory_Findings_Draft.docx
+++ b/docs/REST_Kafka_Exploratory_Findings_Draft.docx
@@ -8039,7 +8039,7 @@
           <w:color w:val="000000"/>
           <w:sz w:val="20"/>
         </w:rPr>
-        <w:t>The code, a redacted copy of the evidence for all sixteen runs, the analysis, the figures, and this draft are publicly available [17] under Apache-2.0 for code and CC BY 4.0 for evidence and text, with an archival identifier pending. The public copy is generated from the private archive by scripts that replace the capture host name, home paths, Docker identity, and the names of unrelated containers with neutral tokens and record the SHA-256 of every original file, so it can be verified against the archive; no experiment number depends on a redacted field. The public repository also lets another site start its own guarded chain with the same protocols. Independent reproduction by a third party has not yet been established.</w:t>
+        <w:t>The code, a redacted copy of the evidence for all sixteen runs, the analysis, the figures, and this draft are publicly available [17] under Apache-2.0 for code and CC BY 4.0 for evidence and text, archived at Zenodo (doi: 10.5281/zenodo.22933798). The public copy is generated from the private archive by scripts that replace the capture host name, home paths, Docker identity, and the names of unrelated containers with neutral tokens and record the SHA-256 of every original file, so it can be verified against the archive; no experiment number depends on a redacted field. The public repository also lets another site start its own guarded chain with the same protocols. Independent reproduction by a third party has not yet been established.</w:t>
       </w:r>
     </w:p>
     <w:p>
@@ -8441,7 +8441,7 @@
           <w:color w:val="000000"/>
           <w:sz w:val="16"/>
         </w:rPr>
-        <w:t>[17] S. Lubanga, “Mobile-money coordination benchmark: Code, redacted evidence, analysis and paper,” v1.2.0, GitHub, 2026. https://github.com/shaban2/mobile-money-coordination-benchmark</w:t>
+        <w:t>[17] S. Lubanga, “Mobile-money coordination benchmark: Code, redacted evidence, analysis and paper,” v1.2.2, Zenodo, 2026. doi: 10.5281/zenodo.22933798. https://github.com/shaban2/mobile-money-coordination-benchmark</w:t>
       </w:r>
     </w:p>
     <w:sectPr>

</xml_diff>

<commit_message>
Paper: DOI printed as a URL
Co-Authored-By: Claude Fable 5.1 <noreply@anthropic.com>
</commit_message>
<xml_diff>
--- a/docs/REST_Kafka_Exploratory_Findings_Draft.docx
+++ b/docs/REST_Kafka_Exploratory_Findings_Draft.docx
@@ -8039,7 +8039,7 @@
           <w:color w:val="000000"/>
           <w:sz w:val="20"/>
         </w:rPr>
-        <w:t>The code, a redacted copy of the evidence for all sixteen runs, the analysis, the figures, and this draft are publicly available [17] under Apache-2.0 for code and CC BY 4.0 for evidence and text, archived at Zenodo (doi: 10.5281/zenodo.22933798). The public copy is generated from the private archive by scripts that replace the capture host name, home paths, Docker identity, and the names of unrelated containers with neutral tokens and record the SHA-256 of every original file, so it can be verified against the archive; no experiment number depends on a redacted field. The public repository also lets another site start its own guarded chain with the same protocols. Independent reproduction by a third party has not yet been established.</w:t>
+        <w:t>The code, a redacted copy of the evidence for all sixteen runs, the analysis, the figures, and this draft are publicly available [17] under Apache-2.0 for code and CC BY 4.0 for evidence and text, archived at Zenodo under the all-versions identifier https://doi.org/10.5281/zenodo.22933798. The public copy is generated from the private archive by scripts that replace the capture host name, home paths, Docker identity, and the names of unrelated containers with neutral tokens and record the SHA-256 of every original file, so it can be verified against the archive; no experiment number depends on a redacted field. The public repository also lets another site start its own guarded chain with the same protocols. Independent reproduction by a third party has not yet been established.</w:t>
       </w:r>
     </w:p>
     <w:p>
@@ -8441,7 +8441,7 @@
           <w:color w:val="000000"/>
           <w:sz w:val="16"/>
         </w:rPr>
-        <w:t>[17] S. Lubanga, “Mobile-money coordination benchmark: Code, redacted evidence, analysis and paper,” v1.2.2, Zenodo, 2026. doi: 10.5281/zenodo.22933798. https://github.com/shaban2/mobile-money-coordination-benchmark</w:t>
+        <w:t>[17] S. Lubanga, “Mobile-money coordination benchmark: Code, redacted evidence, analysis and paper,” v1.2.2, Zenodo, 2026. https://doi.org/10.5281/zenodo.22933798 (all versions). https://github.com/shaban2/mobile-money-coordination-benchmark</w:t>
       </w:r>
     </w:p>
     <w:sectPr>

</xml_diff>

<commit_message>
Public release 1.2.3: citation corrections in the paper
Reword the sentences citing [7], [13], [14] so they no longer follow the
source wording, and narrow [8], [9], [11], [12], [15] to what the sources
support. Remove Kristianto & Zahra and renumber references to [1]-[16].
Evidence re-exported from private commit 6f39c17; file contents unchanged,
analysis identical apart from redacted host fields.

Co-Authored-By: Claude Opus 5.5 (1M context) <noreply@anthropic.com>
</commit_message>
<xml_diff>
--- a/docs/REST_Kafka_Exploratory_Findings_Draft.docx
+++ b/docs/REST_Kafka_Exploratory_Findings_Draft.docx
@@ -128,7 +128,7 @@
           <w:color w:val="000000"/>
           <w:sz w:val="20"/>
         </w:rPr>
-        <w:t>Mobile money lets people store and move value through an account tied to a mobile phone number, usually operated by a telecom provider. Because a sender and a recipient may use different providers, transfers between them depend on interoperability, which research on mobile payments identifies as a continuing economic and policy problem [13]; payment-policy bodies recommend harmonised application programming interfaces (APIs) because fragmented API standards raise processing time, cost, and error risk [14].</w:t>
+        <w:t>Mobile money lets people store and move value through an account tied to a mobile phone number, usually operated by a telecom provider. Because a sender and a recipient may use different providers, transfers between them depend on interoperability, which research on mobile payments treats as a central economic and policy question [12]; for cross-border payments, the Committee on Payments and Market Infrastructures recommends harmonising application programming interfaces (APIs), since divergent standards make payments slower, costlier, and more error-prone [13].</w:t>
       </w:r>
     </w:p>
     <w:p>
@@ -224,7 +224,7 @@
           <w:color w:val="000000"/>
           <w:sz w:val="20"/>
         </w:rPr>
-        <w:t>The GSMA Mobile Money API specification [15] defines the message language (party identifiers, amount, currency, transaction references, and status) and its asynchronous callback and polling flows; its P2P use case [1] frames the transfer in Fig. 1. Mojaloop [16] helps explain provider boundaries and a staged lookup, quote, and transfer workflow. Neither decides how the platform coordinates its own work. This paper varies one internal design choice while everything else stays fixed: REST orchestration, where a coordinator calls the workflow steps in sequence, versus Kafka choreography, where co-located handlers react to events carried through a broker and durable database records. Both implementations acknowledge the request first (HTTP 202) and deliver the result later. Because that early acknowledgement can arrive before the transfer is safely stored, we measure each transfer from the moment the API receives it to the moment the database confirms its final commit, and we count only transfers that completed, were not duplicated, and left the ledger balanced.</w:t>
+        <w:t>The GSMA Mobile Money API specification [14] defines the transaction data (amount, currency, transaction references, and request status) and its asynchronous callback and polling flows; its P2P use case [1] frames the transfer in Fig. 1. Mojaloop [15] helps explain provider boundaries and a staged lookup, quote, and transfer workflow. Neither decides how the platform coordinates its own work. This paper varies one internal design choice while everything else stays fixed: REST orchestration, where a coordinator calls the workflow steps in sequence, versus Kafka choreography, where co-located handlers react to events carried through a broker and durable database records. Both implementations acknowledge the request first (HTTP 202) and deliver the result later. Because that early acknowledgement can arrive before the transfer is safely stored, we measure each transfer from the moment the API receives it to the moment the database confirms its final commit, and we count only transfers that completed, were not duplicated, and left the ledger balanced.</w:t>
       </w:r>
     </w:p>
     <w:p>
@@ -408,7 +408,7 @@
           <w:color w:val="000000"/>
           <w:sz w:val="20"/>
         </w:rPr>
-        <w:t>Kristianto and Zahra vary service count, concurrent users, and instances in distributed Saga implementations [4]. Both of their coordination models use Kafka, unlike our direct-call versus event-driven packages. Their reported choreography advantage is tied to that deployment and does not contradict a different observation in our co-located implementation. We do not compare numerical latencies across these studies.</w:t>
+        <w:t>Nadeem and Malik port the TrainTicket benchmark to the Temporal workflow engine, report initial findings on debugging time, and identify fuller evaluation as future work [8]; we adopt the same early-results positioning. Hegde et al. compare synchronous and asynchronous microservice implementations using k6, Docker resource monitoring, and worker termination, and report API-response performance [9]. Our endpoint is durable ledger completion rather than API response, and both of our conditions expose an asynchronous client contract. Aydın and Çebi examine choreography and orchestration Saga implementations with isolated NoSQL databases and cross-service rollback [10]; our common ledger is not that setting. The outbox side of our Kafka condition follows the transactional outbox pattern described by Richardson [11]; the inbox, which records processed message identifiers to discard duplicates, follows his idempotent-consumer approach [11].</w:t>
       </w:r>
     </w:p>
     <w:p>
@@ -426,25 +426,7 @@
           <w:color w:val="000000"/>
           <w:sz w:val="20"/>
         </w:rPr>
-        <w:t>Nadeem and Malik report initial findings from porting a benchmark system to a workflow engine and identify fuller evaluation as future work [9]; we adopt the same early-results positioning. Hegde et al. compare synchronous and asynchronous microservice implementations using k6, Docker resource monitoring, and worker termination, and report API-response performance [10]. Our endpoint is durable ledger completion rather than API response, and both of our conditions expose an asynchronous client contract. Aydın and Çebi examine choreography and orchestration Saga implementations with isolated databases and cross-service rollback [11]; our common ledger is not that setting. The inbox/outbox mechanism in our Kafka condition follows the transactional outbox pattern described by Richardson [12].</w:t>
-      </w:r>
-    </w:p>
-    <w:p>
-      <w:pPr>
-        <w:widowControl/>
-        <w:spacing w:before="0" w:after="0" w:line="240" w:lineRule="auto"/>
-        <w:ind w:firstLine="202"/>
-        <w:jc w:val="both"/>
-      </w:pPr>
-      <w:r>
-        <w:rPr>
-          <w:rFonts w:ascii="Times New Roman" w:hAnsi="Times New Roman"/>
-          <w:b w:val="0"/>
-          <w:i w:val="0"/>
-          <w:color w:val="000000"/>
-          <w:sz w:val="20"/>
-        </w:rPr>
-        <w:t>Hasselbring argues that useful benchmarking requires explicit workloads, fairness, verifiability, and a replication package [5]. Kalibera and Jones emphasize repetition at the level where performance varies [6]. These considerations motivate our documented scope and our refusal to treat thousands of transfers within a run as thousands of independent architecture experiments.</w:t>
+        <w:t>Hasselbring argues that useful benchmarking requires explicit workloads, fairness, verifiability, and a replication package [4]. Kalibera and Jones emphasize repetition at the level where performance varies [5]. These considerations motivate our documented scope and our refusal to treat thousands of transfers within a run as thousands of independent architecture experiments.</w:t>
       </w:r>
     </w:p>
     <w:p>
@@ -1416,7 +1398,7 @@
           <w:color w:val="000000"/>
           <w:sz w:val="20"/>
         </w:rPr>
-        <w:t>k6 uses the constant-arrival-rate executor to schedule operations independently of completion time while virtual users are available [7]. An operation is either a creation attempt or a status read, not necessarily a new transfer. The repeating 100-operation schedule contains 76 unique creations, four idempotent creation replays, and 20 status reads. Thus replays are 5% of creation attempts and 4% of all operations; these proportions are benchmark choices rather than estimates from customer traffic.</w:t>
+        <w:t>k6's constant-arrival-rate executor starts operations at a fixed rate regardless of response time, provided enough pre-allocated virtual users remain [6]. An operation is either a creation attempt or a status read, not necessarily a new transfer. The repeating 100-operation schedule contains 76 unique creations, four idempotent creation replays, and 20 status reads. Thus replays are 5% of creation attempts and 4% of all operations; these proportions are benchmark choices rather than estimates from customer traffic.</w:t>
       </w:r>
     </w:p>
     <w:p>
@@ -1656,7 +1638,7 @@
           <w:color w:val="000000"/>
           <w:sz w:val="20"/>
         </w:rPr>
-        <w:t>Resource summaries sum the application, gateway, PostgreSQL, Toxiproxy, adapter, callback receiver, Prometheus, and Grafana, plus Redpanda for Kafka. They exclude k6, the controller, and host overhead. Memory is Docker CLI usage, which subtracts cache on Linux [8]; CPU sums container percentages divided by 100. Means are time-weighted over samples about 2 s apart within measurement; a stopped adapter contributes zero while absent. These are descriptive footprints, not cost or reserved capacity.</w:t>
+        <w:t>Resource summaries sum the application, gateway, PostgreSQL, Toxiproxy, adapter, callback receiver, Prometheus, and Grafana, plus Redpanda for Kafka. They exclude k6, the controller, and host overhead. Memory is the usage reported by the Docker CLI, which excludes cache on Linux [7]; for CPU, we sum the per-container percentages and divide by 100. Means are time-weighted over samples about 2 s apart within measurement; a stopped adapter contributes zero while absent. These are descriptive footprints, not cost or reserved capacity.</w:t>
       </w:r>
     </w:p>
     <w:p>
@@ -8039,7 +8021,7 @@
           <w:color w:val="000000"/>
           <w:sz w:val="20"/>
         </w:rPr>
-        <w:t>The code, a redacted copy of the evidence for all sixteen runs, the analysis, the figures, and this draft are publicly available [17] under Apache-2.0 for code and CC BY 4.0 for evidence and text, archived at Zenodo under the all-versions identifier https://doi.org/10.5281/zenodo.22933798. The public copy is generated from the private archive by scripts that replace the capture host name, home paths, Docker identity, and the names of unrelated containers with neutral tokens and record the SHA-256 of every original file, so it can be verified against the archive; no experiment number depends on a redacted field. The public repository also lets another site start its own guarded chain with the same protocols. Independent reproduction by a third party has not yet been established.</w:t>
+        <w:t>The code, a redacted copy of the evidence for all sixteen runs, the analysis, the figures, and this draft are publicly available [16] under Apache-2.0 for code and CC BY 4.0 for evidence and text, archived at Zenodo under the all-versions identifier https://doi.org/10.5281/zenodo.22933798. The public copy is generated from the private archive by scripts that replace the capture host name, home paths, Docker identity, and the names of unrelated containers with neutral tokens and record the SHA-256 of every original file, so it can be verified against the archive; no experiment number depends on a redacted field. The public repository also lets another site start its own guarded chain with the same protocols. Independent reproduction by a third party has not yet been established.</w:t>
       </w:r>
     </w:p>
     <w:p>
@@ -8207,7 +8189,7 @@
           <w:color w:val="000000"/>
           <w:sz w:val="16"/>
         </w:rPr>
-        <w:t>[4] H. Kristianto and A. Zahra, “Performance Analysis of Choreography and Orchestration in Microservices Architecture,” Journal of Theoretical and Applied Information Technology, vol. 99, no. 18, pp. 4220–4230, 2021. https://www.jatit.org/volumes/Vol99No18/4Vol99No18.pdf</w:t>
+        <w:t>[4] W. Hasselbring, “Benchmarking as Empirical Standard in Software Engineering Research,” in Proc. Evaluation and Assessment in Software Engineering (EASE), pp. 365–372, 2021. doi: 10.1145/3463274.3463361.</w:t>
       </w:r>
     </w:p>
     <w:p>
@@ -8225,7 +8207,7 @@
           <w:color w:val="000000"/>
           <w:sz w:val="16"/>
         </w:rPr>
-        <w:t>[5] W. Hasselbring, “Benchmarking as Empirical Standard in Software Engineering Research,” in Proc. Evaluation and Assessment in Software Engineering (EASE), pp. 365–372, 2021. doi: 10.1145/3463274.3463361.</w:t>
+        <w:t>[5] T. Kalibera and R. Jones, “Rigorous Benchmarking in Reasonable Time,” in Proc. International Symposium on Memory Management (ISMM), pp. 63–74, 2013. doi: 10.1145/2464157.2464160.</w:t>
       </w:r>
     </w:p>
     <w:p>
@@ -8243,7 +8225,7 @@
           <w:color w:val="000000"/>
           <w:sz w:val="16"/>
         </w:rPr>
-        <w:t>[6] T. Kalibera and R. Jones, “Rigorous Benchmarking in Reasonable Time,” in Proc. International Symposium on Memory Management (ISMM), pp. 63–74, 2013. doi: 10.1145/2464157.2464160.</w:t>
+        <w:t>[6] Grafana Labs, “Constant arrival rate,” k6 documentation. Accessed Sep. 21, 2026. https://grafana.com/docs/k6/latest/using-k6/scenarios/executors/constant-arrival-rate/</w:t>
       </w:r>
     </w:p>
     <w:p>
@@ -8261,7 +8243,7 @@
           <w:color w:val="000000"/>
           <w:sz w:val="16"/>
         </w:rPr>
-        <w:t>[7] Grafana Labs, “Constant arrival rate,” k6 documentation. Accessed Sep. 21, 2026. https://grafana.com/docs/k6/latest/using-k6/scenarios/executors/constant-arrival-rate/</w:t>
+        <w:t>[7] Docker, “docker container stats,” Docker documentation. Accessed Sep. 21, 2026. https://docs.docker.com/reference/cli/docker/container/stats/</w:t>
       </w:r>
     </w:p>
     <w:p>
@@ -8279,7 +8261,7 @@
           <w:color w:val="000000"/>
           <w:sz w:val="16"/>
         </w:rPr>
-        <w:t>[8] Docker, “docker container stats,” Docker documentation. Accessed Sep. 21, 2026. https://docs.docker.com/reference/cli/docker/container/stats/</w:t>
+        <w:t>[8] A. Nadeem and M. Z. Malik, “A Case for Microservices Orchestration Using Workflow Engines,” in Proc. IEEE/ACM 44th Int. Conf. Software Engineering: New Ideas and Emerging Results (ICSE-NIER), pp. 6–10, 2022. doi: 10.1145/3510455.3512777.</w:t>
       </w:r>
     </w:p>
     <w:p>
@@ -8297,7 +8279,7 @@
           <w:color w:val="000000"/>
           <w:sz w:val="16"/>
         </w:rPr>
-        <w:t>[9] A. Nadeem and M. Z. Malik, “A Case for Microservices Orchestration Using Workflow Engines,” in Proc. IEEE/ACM 44th Int. Conf. Software Engineering: New Ideas and Emerging Results (ICSE-NIER), pp. 6–10, 2022. doi: 10.1145/3510455.3512777.</w:t>
+        <w:t>[9] P. Hegde N et al., “An Empirical Evaluation of Synchronous vs Asynchronous Microservice Architectures for Enterprise Messaging Platforms,” in Proc. Int. Conf. Artificial Intelligence and Data Engineering (AIDE), pp. 663–666, 2026. doi: 10.1109/AIDE69088.2026.11545016.</w:t>
       </w:r>
     </w:p>
     <w:p>
@@ -8315,7 +8297,7 @@
           <w:color w:val="000000"/>
           <w:sz w:val="16"/>
         </w:rPr>
-        <w:t>[10] P. Hegde N et al., “An Empirical Evaluation of Synchronous vs Asynchronous Microservice Architectures for Enterprise Messaging Platforms,” in Proc. Int. Conf. Artificial Intelligence and Data Engineering (AIDE), pp. 663–666, 2026. doi: 10.1109/AIDE69088.2026.11545016.</w:t>
+        <w:t>[10] S. Aydın and C. B. Çebi, “Comparison of Choreography vs Orchestration Based Saga Patterns in Microservices,” in Proc. Int. Conf. Electrical, Computer and Energy Technologies (ICECET), pp. 1–6, 2022. doi: 10.1109/ICECET55527.2022.9872665.</w:t>
       </w:r>
     </w:p>
     <w:p>
@@ -8333,7 +8315,7 @@
           <w:color w:val="000000"/>
           <w:sz w:val="16"/>
         </w:rPr>
-        <w:t>[11] S. Aydın and C. B. Çebi, “Comparison of Choreography vs Orchestration Based Saga Patterns in Microservices,” in Proc. Int. Conf. Electrical, Computer and Energy Technologies (ICECET), pp. 1–6, 2022. doi: 10.1109/ICECET55527.2022.9872665.</w:t>
+        <w:t>[11] C. Richardson, Microservices Patterns: With Examples in Java. Shelter Island, NY, USA: Manning, 2018.</w:t>
       </w:r>
     </w:p>
     <w:p>
@@ -8351,7 +8333,7 @@
           <w:color w:val="000000"/>
           <w:sz w:val="16"/>
         </w:rPr>
-        <w:t>[12] C. Richardson, Microservices Patterns: With Examples in Java. Shelter Island, NY, USA: Manning, 2018.</w:t>
+        <w:t>[12] M. Bianchi, M. Bouvard, R. Gomes, A. Rhodes, and V. Shreeti, “Mobile payments and interoperability: Insights from the academic literature,” Information Economics and Policy, vol. 65, art. 101068, 2023. doi: 10.1016/j.infoecopol.2023.101068.</w:t>
       </w:r>
     </w:p>
     <w:p>
@@ -8369,7 +8351,7 @@
           <w:color w:val="000000"/>
           <w:sz w:val="16"/>
         </w:rPr>
-        <w:t>[13] M. Bianchi, M. Bouvard, R. Gomes, A. Rhodes, and V. Shreeti, “Mobile payments and interoperability: Insights from the academic literature,” Information Economics and Policy, vol. 65, art. 101068, 2023. doi: 10.1016/j.infoecopol.2023.101068.</w:t>
+        <w:t>[13] Committee on Payments and Market Infrastructures, “Promoting the harmonisation of application programming interfaces to enhance cross-border payments: Recommendations and toolkit,” Bank for International Settlements, Basel, 2024. https://www.bis.org/cpmi/publ/d224.htm</w:t>
       </w:r>
     </w:p>
     <w:p>
@@ -8387,7 +8369,7 @@
           <w:color w:val="000000"/>
           <w:sz w:val="16"/>
         </w:rPr>
-        <w:t>[14] Committee on Payments and Market Infrastructures, “Promoting the harmonisation of application programming interfaces to enhance cross-border payments: Recommendations and toolkit,” Bank for International Settlements, Basel, 2024. https://www.bis.org/cpmi/publ/d224.htm</w:t>
+        <w:t>[14] GSMA, “Mobile Money API Specification 1.2.0: Fundamentals,” GSMA, London, 2021. https://www.gsma.com/mobilefordevelopment/wp-content/uploads/2021/10/Mobile-Money-API-Specification-1.2.0-Fundamentals.pdf</w:t>
       </w:r>
     </w:p>
     <w:p>
@@ -8405,7 +8387,7 @@
           <w:color w:val="000000"/>
           <w:sz w:val="16"/>
         </w:rPr>
-        <w:t>[15] GSMA, “Mobile Money API Specification 1.2.0: Fundamentals,” GSMA, London, 2021. https://www.gsma.com/mobilefordevelopment/wp-content/uploads/2021/10/Mobile-Money-API-Specification-1.2.0-Fundamentals.pdf</w:t>
+        <w:t>[15] Mojaloop Foundation, “Mojaloop Hub,” Mojaloop documentation, 2022. https://docs.mojaloop.io/technical/overview/</w:t>
       </w:r>
     </w:p>
     <w:p>
@@ -8423,25 +8405,7 @@
           <w:color w:val="000000"/>
           <w:sz w:val="16"/>
         </w:rPr>
-        <w:t>[16] Mojaloop Foundation, “Mojaloop Hub,” Mojaloop documentation, 2022. https://docs.mojaloop.io/technical/overview/</w:t>
-      </w:r>
-    </w:p>
-    <w:p>
-      <w:pPr>
-        <w:widowControl/>
-        <w:spacing w:before="0" w:after="40" w:line="240" w:lineRule="auto"/>
-        <w:ind w:left="230" w:hanging="230"/>
-        <w:jc w:val="left"/>
-      </w:pPr>
-      <w:r>
-        <w:rPr>
-          <w:rFonts w:ascii="Times New Roman" w:hAnsi="Times New Roman"/>
-          <w:b w:val="0"/>
-          <w:i w:val="0"/>
-          <w:color w:val="000000"/>
-          <w:sz w:val="16"/>
-        </w:rPr>
-        <w:t>[17] S. Lubanga, “Mobile-money coordination benchmark: Code, redacted evidence, analysis and paper,” v1.2.2, Zenodo, 2026. https://doi.org/10.5281/zenodo.22933798 (all versions). https://github.com/shaban2/mobile-money-coordination-benchmark</w:t>
+        <w:t>[16] S. Lubanga, “Mobile-money coordination benchmark: Code, redacted evidence, analysis and paper,” v1.2.3, Zenodo, 2026. https://doi.org/10.5281/zenodo.22933798 (all versions). https://github.com/shaban2/mobile-money-coordination-benchmark</w:t>
       </w:r>
     </w:p>
     <w:sectPr>

</xml_diff>